<commit_message>
Expand DOCX PDF layout coverage
  Import section columns, hard column breaks, paragraph keep settings, typed notes,
  table row and margin properties, and floating DrawingML anchors through generated
  OOXML types. Extend layout for section columns, repeated table headers, keep
  preflight, referenced notes, table cell margins, and initial floating image
  placement.

  Update DOCX fixture generation and rendering spec with the new coverage and
  clustered fixture strategy.
</commit_message>
<xml_diff>
--- a/test-data/wml/table_props.docx
+++ b/test-data/wml/table_props.docx
@@ -5,6 +5,12 @@
     <w:tbl>
       <w:tblPr>
         <w:tblW w:w="5000" w:type="pct"/>
+        <w:tblCellMar>
+          <w:top w:w="120" w:type="dxa"/>
+          <w:left w:w="180" w:type="dxa"/>
+          <w:bottom w:w="120" w:type="dxa"/>
+          <w:right w:w="180" w:type="dxa"/>
+        </w:tblCellMar>
       </w:tblPr>
       <w:tblGrid>
         <w:gridCol w:w="4320"/>
@@ -19,6 +25,12 @@
           <w:tcPr>
             <w:tcW w:w="4320" w:type="dxa"/>
             <w:vAlign w:val="center"/>
+            <w:tcMar>
+              <w:top w:w="240" w:type="dxa"/>
+              <w:left w:w="360" w:type="dxa"/>
+              <w:bottom w:w="240" w:type="dxa"/>
+              <w:right w:w="360" w:type="dxa"/>
+            </w:tcMar>
           </w:tcPr>
           <w:p>
             <w:r>

</xml_diff>

<commit_message>
Advance DOCX PDF layout coverage
  Import external hyperlink relationships through the OOXML SDK part model and
  emit PDF link annotations via krilla. Add dynamic PAGE/NUMPAGES field markers
  that resolve after pagination for complex fields, simple fields, and w:pgNum.

  Improve Writer-aligned layout adapters for footnote page areas, table preferred
  width/alignment/indent, nested table-cell flow, and paragraph-local square/tight
  floating image wrap. Update WML table fixture coverage and the DOCX PDF rendering
  plan.
</commit_message>
<xml_diff>
--- a/test-data/wml/table_props.docx
+++ b/test-data/wml/table_props.docx
@@ -4,7 +4,9 @@
   <w:body>
     <w:tbl>
       <w:tblPr>
-        <w:tblW w:w="5000" w:type="pct"/>
+        <w:tblW w:w="4000" w:type="pct"/>
+        <w:jc w:val="center"/>
+        <w:tblInd w:w="240" w:type="dxa"/>
         <w:tblCellMar>
           <w:top w:w="120" w:type="dxa"/>
           <w:left w:w="180" w:type="dxa"/>

</xml_diff>